<commit_message>
Repo clean-up for delivery; pages, slides, animation and deck on v3
- Root = course replication structure (README.txt replication README, DOWNLOAD_LOG, data*, code, output, tests)
- deliverables/ (brief PDF + Word, slides pptx/pdf, map videos), tools/make_delivery.py (replication zip +
  all-materials zip; files under 50 MB included, personal data never), course/ (instructor files), archive/
- docs/overnight -> docs/walkthrough; Ruby's review -> docs/review; review plan -> docs/methods
- Walkthrough and methods pages rewritten on net additions (agent), deck + slide figures + map animation rebuilt
  to storyline v3 (agent); wording fix: stopping explains a quarter to a half, the rest is fewer new pits
- Fresh-unzip test: all 2,740 numbers and the 71 brief numbers reproduce exactly; brief figure byte-identical

Co-Authored-By: Claude Opus 5.5 (1M context) <noreply@anthropic.com>
</commit_message>
<xml_diff>
--- a/docs/brief/BRIEF.docx
+++ b/docs/brief/BRIEF.docx
@@ -458,7 +458,7 @@
         <w:t xml:space="preserve">if the other Peruvian buffer zones show what the Tambopata buffer zone would otherwise have done</w:t>
       </w:r>
       <w:r>
-        <w:t xml:space="preserve">, Mercurio and the operations that followed lowered its net mining additions by about 1,453 to 1,663 ha/yr in 2019–21 (all 14 zones, or Amarakaeri alone, 2014–18 baseline). A quarter to a half of it is land stopping (in this model 759 of 1,453), not less new clearing; the fall is large in hectares but ordinary relative to the zone's size (3th–6th of 7 by scaling; in hectares it also ranks first in 2014–16, before Mercurio). Read it as an upper bound (4b).</w:t>
+        <w:t xml:space="preserve">, Mercurio and the operations that followed lowered its net mining additions by about 1,453 to 1,663 ha/yr in 2019–21 (all 14 zones, or Amarakaeri alone, 2014–18 baseline). A quarter to a half of it is land stopping (in this model 759 of 1,453); the rest is less new clearing; the fall is large in hectares but ordinary relative to the zone's size (3th–6th of 7 by scaling; in hectares it also ranks first in 2014–16, before Mercurio). Read it as an upper bound (4b).</w:t>
       </w:r>
     </w:p>
     <w:p>
@@ -690,7 +690,7 @@
       <w:r>
         <w:t xml:space="preserve">, 12, 094004. </w:t>
       </w:r>
-      <w:hyperlink w:history="1" r:id="rId8vnrmitwfydcvu3zfgk7e">
+      <w:hyperlink w:history="1" r:id="rIdg5fzeqtoffhgn7pzhlcw7">
         <w:r>
           <w:rPr>
             <w:rStyle w:val="Hyperlink"/>
@@ -724,7 +724,7 @@
       <w:r>
         <w:t xml:space="preserve">, 93(1), 113–125. </w:t>
       </w:r>
-      <w:hyperlink w:history="1" r:id="rIdlfcgemr9mo6cjmlxyhkxa">
+      <w:hyperlink w:history="1" r:id="rIdk5u9yiredycj1kjhb-bxj">
         <w:r>
           <w:rPr>
             <w:rStyle w:val="Hyperlink"/>
@@ -758,7 +758,7 @@
       <w:r>
         <w:t xml:space="preserve">, 16(5), e12978. </w:t>
       </w:r>
-      <w:hyperlink w:history="1" r:id="rIduzldnscbrsvbvsecgs5mb">
+      <w:hyperlink w:history="1" r:id="rIde_hqvprp0vzt5ernl6qpz">
         <w:r>
           <w:rPr>
             <w:rStyle w:val="Hyperlink"/>
@@ -782,7 +782,7 @@
       <w:r>
         <w:t xml:space="preserve">Earth Genome (2026). Amazon Mining Watch, mining detections, model 48px_v4.10b (updated 3 Oct 2026). </w:t>
       </w:r>
-      <w:hyperlink w:history="1" r:id="rIdfavoj_k6uwfa8eprxvron">
+      <w:hyperlink w:history="1" r:id="rIdplnas5pmpemutbx4uwvie">
         <w:r>
           <w:rPr>
             <w:rStyle w:val="Hyperlink"/>
@@ -806,7 +806,7 @@
       <w:r>
         <w:t xml:space="preserve">Finer, M., &amp; Mamani, N. (2020, 1 Dec). Illegal gold mining down 78% in Peruvian Amazon, but still threatens key areas. MAAP #130, figures "La Pampa" and "Before and after". </w:t>
       </w:r>
-      <w:hyperlink w:history="1" r:id="rIdth9eqzdnc3tnzv1mpplbs">
+      <w:hyperlink w:history="1" r:id="rIdc816okayitrcxfjawci3a">
         <w:r>
           <w:rPr>
             <w:rStyle w:val="Hyperlink"/>
@@ -830,7 +830,7 @@
       <w:r>
         <w:t xml:space="preserve">Frankfurt Zoological Society (n.d.). Bahuaja-Sonene and Tambopata. </w:t>
       </w:r>
-      <w:hyperlink w:history="1" r:id="rId9kprrbk7ggyd2vgo0qae-">
+      <w:hyperlink w:history="1" r:id="rIdacrspbcpt6y7dpoxhiarx">
         <w:r>
           <w:rPr>
             <w:rStyle w:val="Hyperlink"/>
@@ -854,7 +854,7 @@
       <w:r>
         <w:t xml:space="preserve">MapBiomas Amazonía (2024). Colección 6.0 de mapas anuales de cobertura y uso del suelo en la Amazonía, 1985–2023; factsheet p. 3. </w:t>
       </w:r>
-      <w:hyperlink w:history="1" r:id="rIduoikqtrbjgieg-tojfvym">
+      <w:hyperlink w:history="1" r:id="rIdu1az5yg2bvj-hwecnlwjb">
         <w:r>
           <w:rPr>
             <w:rStyle w:val="Hyperlink"/>
@@ -878,7 +878,7 @@
       <w:r>
         <w:t xml:space="preserve">MapBiomas Brasil (2025). Collection 11 (mining) and Collection 10.1 (indigenous-territory statistics). </w:t>
       </w:r>
-      <w:hyperlink w:history="1" r:id="rIdlc9-yz_wslj6vcvo5v58p">
+      <w:hyperlink w:history="1" r:id="rIdoactwvy_vh2r7sqy9ylj_">
         <w:r>
           <w:rPr>
             <w:rStyle w:val="Hyperlink"/>
@@ -902,7 +902,7 @@
       <w:r>
         <w:t xml:space="preserve">MapBiomas Peru (2025). Collection 4 of annual land cover maps of Peru: annual maps and buffer-zone, protected-area and department statistics. </w:t>
       </w:r>
-      <w:hyperlink w:history="1" r:id="rId0qkkdtc9kt_w0s35h8g5v">
+      <w:hyperlink w:history="1" r:id="rIdyvptlkfoya8h610rlsqz6">
         <w:r>
           <w:rPr>
             <w:rStyle w:val="Hyperlink"/>
@@ -926,7 +926,7 @@
       <w:r>
         <w:t xml:space="preserve">MEF (2026). Consulta Amigable, programa presupuestal 0128, Madre de Dios. </w:t>
       </w:r>
-      <w:hyperlink w:history="1" r:id="rIdzizct6dzobs72kq-zw49x">
+      <w:hyperlink w:history="1" r:id="rId2ytrhiojbujbylqbqel_v">
         <w:r>
           <w:rPr>
             <w:rStyle w:val="Hyperlink"/>
@@ -950,7 +950,7 @@
       <w:r>
         <w:t xml:space="preserve">MINAM (2021). Plan Restauración: Plan integral frente a la minería ilegal (Anexo, D.S. N° 017-2021-MINAM), pp. 33, 55–56. </w:t>
       </w:r>
-      <w:hyperlink w:history="1" r:id="rIdvfskxwykvk6byfmmsadk7">
+      <w:hyperlink w:history="1" r:id="rId3pkszqm8eb4r2glxla8e0">
         <w:r>
           <w:rPr>
             <w:rStyle w:val="Hyperlink"/>
@@ -974,7 +974,7 @@
       <w:r>
         <w:t xml:space="preserve">MINEM (2026). Estadísticas mineras: producción minera; and BCRP (2026), Madre de Dios gold production series. </w:t>
       </w:r>
-      <w:hyperlink w:history="1" r:id="rId5sr0udnb9ay8gsokyyase">
+      <w:hyperlink w:history="1" r:id="rIdcyyia2fhoapfmq-6rnv4e">
         <w:r>
           <w:rPr>
             <w:rStyle w:val="Hyperlink"/>
@@ -985,7 +985,7 @@
       <w:r>
         <w:t xml:space="preserve"> ; </w:t>
       </w:r>
-      <w:hyperlink w:history="1" r:id="rIdcq5ttkxm4yawx0r8nwiit">
+      <w:hyperlink w:history="1" r:id="rIdgxiczr2smsltoutjpcq_n">
         <w:r>
           <w:rPr>
             <w:rStyle w:val="Hyperlink"/>
@@ -1009,7 +1009,7 @@
       <w:r>
         <w:t xml:space="preserve">Pacsi, R., Novoa, S., La Torre, S., Balbuena, H., Finer, M., Santana, A., &amp; Castillo, H. (2026, 10 May). Rapid expansion of illegal gold mining in Tambopata National Reserve. MAAP #241, Image 1. </w:t>
       </w:r>
-      <w:hyperlink w:history="1" r:id="rIdvu1jgqvcnmijdk9vertsr">
+      <w:hyperlink w:history="1" r:id="rIdjnymoosgaqaduqnttamam">
         <w:r>
           <w:rPr>
             <w:rStyle w:val="Hyperlink"/>
@@ -1033,7 +1033,7 @@
       <w:r>
         <w:t xml:space="preserve">Peru (2004). Ley N° 28258, Ley de Regalía Minera, Art. 5 and Art. 10. </w:t>
       </w:r>
-      <w:hyperlink w:history="1" r:id="rId-zujre0ynlshgdaz5ozs9">
+      <w:hyperlink w:history="1" r:id="rIdzvb8bktg-deieaduhhccz">
         <w:r>
           <w:rPr>
             <w:rStyle w:val="Hyperlink"/>
@@ -1057,7 +1057,7 @@
       <w:r>
         <w:t xml:space="preserve">University of Maryland GLAD (2026). GLAD-L Landsat forest-loss alerts, 2017–2026. </w:t>
       </w:r>
-      <w:hyperlink w:history="1" r:id="rIda3cjnuu6fdjcxzj5okkw9">
+      <w:hyperlink w:history="1" r:id="rId1mj0il8i0bvpb0ky9xdto">
         <w:r>
           <w:rPr>
             <w:rStyle w:val="Hyperlink"/>
@@ -1081,7 +1081,7 @@
       <w:r>
         <w:t xml:space="preserve">World Bank (2026). Commodity price data (Pink Sheet), monthly, gold. </w:t>
       </w:r>
-      <w:hyperlink w:history="1" r:id="rIdymuzpufvuz3x-qtzkwaf2">
+      <w:hyperlink w:history="1" r:id="rIdoflbgmuwsejqjnnrobzqq">
         <w:r>
           <w:rPr>
             <w:rStyle w:val="Hyperlink"/>
@@ -1105,7 +1105,7 @@
       <w:r>
         <w:t xml:space="preserve">Yupanqui, O., Quispe, M., Novoa, S., Castañeda, C., Escalante, E., Finer, M., &amp; Mamani, N. (2023, 28 Sep). El retorno de minería ilegal en La Pampa. MAAP #193, dredge counts. </w:t>
       </w:r>
-      <w:hyperlink w:history="1" r:id="rIdezxs0uevycy1no2ky-kz5">
+      <w:hyperlink w:history="1" r:id="rIdewxbe3j7hve3dbd7oe3mp">
         <w:r>
           <w:rPr>
             <w:rStyle w:val="Hyperlink"/>

</xml_diff>